<commit_message>
Сorrection of the design
</commit_message>
<xml_diff>
--- a/docs/Отчёт_НИР_Space_Invaders.docx
+++ b/docs/Отчёт_НИР_Space_Invaders.docx
@@ -1048,8 +1048,6 @@
           <w:szCs w:val="32"/>
         </w:rPr>
       </w:pPr>
-      <w:bookmarkStart w:id="0" w:name="_GoBack"/>
-      <w:bookmarkEnd w:id="0"/>
     </w:p>
     <w:p>
       <w:pPr>
@@ -2528,7 +2526,7 @@
           <w:szCs w:val="28"/>
         </w:rPr>
       </w:pPr>
-      <w:bookmarkStart w:id="1" w:name="_Toc239971023"/>
+      <w:bookmarkStart w:id="0" w:name="_Toc239971023"/>
       <w:r>
         <w:rPr>
           <w:rFonts w:ascii="Times New Roman" w:hAnsi="Times New Roman" w:cs="Times New Roman"/>
@@ -2538,7 +2536,7 @@
         <w:lastRenderedPageBreak/>
         <w:t>ВВЕДЕНИЕ</w:t>
       </w:r>
-      <w:bookmarkEnd w:id="1"/>
+      <w:bookmarkEnd w:id="0"/>
     </w:p>
     <w:p>
       <w:pPr>
@@ -2924,7 +2922,7 @@
           <w:szCs w:val="28"/>
         </w:rPr>
       </w:pPr>
-      <w:bookmarkStart w:id="2" w:name="_Toc239971024"/>
+      <w:bookmarkStart w:id="1" w:name="_Toc239971024"/>
       <w:r>
         <w:rPr>
           <w:rFonts w:ascii="Times New Roman" w:hAnsi="Times New Roman" w:cs="Times New Roman"/>
@@ -2934,7 +2932,7 @@
         <w:lastRenderedPageBreak/>
         <w:t>ПОСТАНОВКА ЗАДАЧИ</w:t>
       </w:r>
-      <w:bookmarkEnd w:id="2"/>
+      <w:bookmarkEnd w:id="1"/>
     </w:p>
     <w:p>
       <w:pPr>
@@ -3222,7 +3220,7 @@
           <w:szCs w:val="28"/>
         </w:rPr>
       </w:pPr>
-      <w:bookmarkStart w:id="3" w:name="_Toc239971025"/>
+      <w:bookmarkStart w:id="2" w:name="_Toc239971025"/>
       <w:r>
         <w:rPr>
           <w:rFonts w:ascii="Times New Roman" w:hAnsi="Times New Roman" w:cs="Times New Roman"/>
@@ -3232,7 +3230,7 @@
         <w:lastRenderedPageBreak/>
         <w:t>АРХИТЕКТУРА ПРОГРАММЫ</w:t>
       </w:r>
-      <w:bookmarkEnd w:id="3"/>
+      <w:bookmarkEnd w:id="2"/>
     </w:p>
     <w:p>
       <w:pPr>
@@ -3384,7 +3382,7 @@
           <w:szCs w:val="28"/>
         </w:rPr>
       </w:pPr>
-      <w:bookmarkStart w:id="4" w:name="_Toc239971026"/>
+      <w:bookmarkStart w:id="3" w:name="_Toc239971026"/>
       <w:r>
         <w:rPr>
           <w:rFonts w:ascii="Times New Roman" w:hAnsi="Times New Roman" w:cs="Times New Roman"/>
@@ -3405,7 +3403,7 @@
         </w:rPr>
         <w:t>Game</w:t>
       </w:r>
-      <w:bookmarkEnd w:id="4"/>
+      <w:bookmarkEnd w:id="3"/>
       <w:proofErr w:type="spellEnd"/>
     </w:p>
     <w:p>
@@ -3910,7 +3908,7 @@
           <w:szCs w:val="28"/>
         </w:rPr>
       </w:pPr>
-      <w:bookmarkStart w:id="5" w:name="_Toc239971027"/>
+      <w:bookmarkStart w:id="4" w:name="_Toc239971027"/>
       <w:r>
         <w:rPr>
           <w:rFonts w:ascii="Times New Roman" w:hAnsi="Times New Roman" w:cs="Times New Roman"/>
@@ -3931,7 +3929,7 @@
         </w:rPr>
         <w:t>Player</w:t>
       </w:r>
-      <w:bookmarkEnd w:id="5"/>
+      <w:bookmarkEnd w:id="4"/>
       <w:proofErr w:type="spellEnd"/>
     </w:p>
     <w:p>
@@ -4227,7 +4225,7 @@
           <w:szCs w:val="28"/>
         </w:rPr>
       </w:pPr>
-      <w:bookmarkStart w:id="6" w:name="_Toc239971028"/>
+      <w:bookmarkStart w:id="5" w:name="_Toc239971028"/>
       <w:r>
         <w:rPr>
           <w:rFonts w:ascii="Times New Roman" w:hAnsi="Times New Roman" w:cs="Times New Roman"/>
@@ -4248,7 +4246,7 @@
         </w:rPr>
         <w:t>Enemy</w:t>
       </w:r>
-      <w:bookmarkEnd w:id="6"/>
+      <w:bookmarkEnd w:id="5"/>
       <w:proofErr w:type="spellEnd"/>
     </w:p>
     <w:p>
@@ -4664,7 +4662,7 @@
           <w:szCs w:val="28"/>
         </w:rPr>
       </w:pPr>
-      <w:bookmarkStart w:id="7" w:name="_Toc239971029"/>
+      <w:bookmarkStart w:id="6" w:name="_Toc239971029"/>
       <w:r>
         <w:rPr>
           <w:rFonts w:ascii="Times New Roman" w:hAnsi="Times New Roman" w:cs="Times New Roman"/>
@@ -4685,7 +4683,7 @@
         </w:rPr>
         <w:t>Bullet</w:t>
       </w:r>
-      <w:bookmarkEnd w:id="7"/>
+      <w:bookmarkEnd w:id="6"/>
       <w:proofErr w:type="spellEnd"/>
     </w:p>
     <w:p>
@@ -4960,7 +4958,7 @@
           <w:szCs w:val="28"/>
         </w:rPr>
       </w:pPr>
-      <w:bookmarkStart w:id="8" w:name="_Toc239971030"/>
+      <w:bookmarkStart w:id="7" w:name="_Toc239971030"/>
       <w:r>
         <w:rPr>
           <w:rFonts w:ascii="Times New Roman" w:hAnsi="Times New Roman" w:cs="Times New Roman"/>
@@ -4981,7 +4979,7 @@
         </w:rPr>
         <w:t>Menu</w:t>
       </w:r>
-      <w:bookmarkEnd w:id="8"/>
+      <w:bookmarkEnd w:id="7"/>
       <w:proofErr w:type="spellEnd"/>
     </w:p>
     <w:p>
@@ -5262,7 +5260,7 @@
           <w:szCs w:val="28"/>
         </w:rPr>
       </w:pPr>
-      <w:bookmarkStart w:id="9" w:name="_Toc239971031"/>
+      <w:bookmarkStart w:id="8" w:name="_Toc239971031"/>
       <w:r>
         <w:rPr>
           <w:rFonts w:ascii="Times New Roman" w:hAnsi="Times New Roman" w:cs="Times New Roman"/>
@@ -5272,7 +5270,7 @@
         </w:rPr>
         <w:t>Взаимодействие классов</w:t>
       </w:r>
-      <w:bookmarkEnd w:id="9"/>
+      <w:bookmarkEnd w:id="8"/>
     </w:p>
     <w:p>
       <w:pPr>
@@ -5913,7 +5911,7 @@
           <w:szCs w:val="28"/>
         </w:rPr>
       </w:pPr>
-      <w:bookmarkStart w:id="10" w:name="_Toc239971032"/>
+      <w:bookmarkStart w:id="9" w:name="_Toc239971032"/>
       <w:r>
         <w:rPr>
           <w:rFonts w:ascii="Times New Roman" w:hAnsi="Times New Roman" w:cs="Times New Roman"/>
@@ -5923,7 +5921,7 @@
         <w:lastRenderedPageBreak/>
         <w:t>СБОРКА ПРОГРАММЫ</w:t>
       </w:r>
-      <w:bookmarkEnd w:id="10"/>
+      <w:bookmarkEnd w:id="9"/>
     </w:p>
     <w:p>
       <w:pPr>
@@ -6377,7 +6375,7 @@
           <w:szCs w:val="28"/>
         </w:rPr>
       </w:pPr>
-      <w:bookmarkStart w:id="11" w:name="_Toc239971033"/>
+      <w:bookmarkStart w:id="10" w:name="_Toc239971033"/>
       <w:r>
         <w:rPr>
           <w:rFonts w:ascii="Times New Roman" w:hAnsi="Times New Roman" w:cs="Times New Roman"/>
@@ -6387,7 +6385,7 @@
         <w:lastRenderedPageBreak/>
         <w:t>РУКОВОДСТВО ПОЛЬЗОВАТЕЛЯ</w:t>
       </w:r>
-      <w:bookmarkEnd w:id="11"/>
+      <w:bookmarkEnd w:id="10"/>
     </w:p>
     <w:p>
       <w:pPr>
@@ -6754,7 +6752,17 @@
           <w:sz w:val="28"/>
           <w:szCs w:val="28"/>
         </w:rPr>
-        <w:t>При успешном прохождении десятой волны отображается сообщение о победе.</w:t>
+        <w:t>При успешном прохождении десятой волны отображается сообщен</w:t>
+      </w:r>
+      <w:bookmarkStart w:id="11" w:name="_GoBack"/>
+      <w:bookmarkEnd w:id="11"/>
+      <w:r>
+        <w:rPr>
+          <w:color w:val="000000" w:themeColor="text1"/>
+          <w:sz w:val="28"/>
+          <w:szCs w:val="28"/>
+        </w:rPr>
+        <w:t>ие о победе.</w:t>
       </w:r>
     </w:p>
     <w:p>
@@ -6779,6 +6787,7 @@
       <w:r>
         <w:rPr>
           <w:rStyle w:val="a6"/>
+          <w:b w:val="0"/>
           <w:color w:val="000000" w:themeColor="text1"/>
           <w:sz w:val="28"/>
           <w:szCs w:val="28"/>
@@ -6798,6 +6807,7 @@
       <w:r>
         <w:rPr>
           <w:rStyle w:val="a6"/>
+          <w:b w:val="0"/>
           <w:color w:val="000000" w:themeColor="text1"/>
           <w:sz w:val="28"/>
           <w:szCs w:val="28"/>
@@ -6817,6 +6827,7 @@
       <w:r>
         <w:rPr>
           <w:rStyle w:val="a6"/>
+          <w:b w:val="0"/>
           <w:color w:val="000000" w:themeColor="text1"/>
           <w:sz w:val="28"/>
           <w:szCs w:val="28"/>
@@ -8691,7 +8702,7 @@
 </file>
 
 <file path=customXml/itemProps1.xml><?xml version="1.0" encoding="utf-8"?>
-<ds:datastoreItem xmlns:ds="http://schemas.openxmlformats.org/officeDocument/2006/customXml" ds:itemID="{0CDEA22C-BF65-467A-8AC4-97159A011EB9}">
+<ds:datastoreItem xmlns:ds="http://schemas.openxmlformats.org/officeDocument/2006/customXml" ds:itemID="{707F848E-3B76-41AA-A005-844D360F2CF9}">
   <ds:schemaRefs>
     <ds:schemaRef ds:uri="http://schemas.openxmlformats.org/officeDocument/2006/bibliography"/>
   </ds:schemaRefs>

</xml_diff>